<commit_message>
Add missing-info map, literature & update BIPV notes
Add a derived Missing-Information Map for the BIPV presentation decks and reference it from BIPV_Brain.md (session log updated). The new analysis file consolidates audit gaps into five closure streams (electrical envelope, shutdown/isolation, thermal/packaging, moving interfaces/serviceability, diagnostics/economics) and outlines next artifacts (worksheets, vendor data request, shutdown definition). Also add block-diagram DOCX files and update an existing Step-by-Step guide, plus import several PDF literature references into claude_literature for research support.
</commit_message>
<xml_diff>
--- a/Step-by-Step Guide to Choosing the Most Suitable BIPV Architecture.docx
+++ b/Step-by-Step Guide to Choosing the Most Suitable BIPV Architecture.docx
@@ -8,7 +8,7 @@
         <w:rPr>
           <w:rFonts w:ascii="Times New Roman" w:eastAsia="Times New Roman" w:hAnsi="Times New Roman" w:cs="Times New Roman"/>
           <w:kern w:val="0"/>
-          <w:lang w:val="en-CH" w:eastAsia="en-CH"/>
+          <w:lang w:eastAsia="en-CH"/>
           <w14:ligatures w14:val="none"/>
         </w:rPr>
       </w:pPr>
@@ -18,7 +18,7 @@
           <w:b/>
           <w:bCs/>
           <w:kern w:val="0"/>
-          <w:lang w:val="en-CH" w:eastAsia="en-CH"/>
+          <w:lang w:eastAsia="en-CH"/>
           <w14:ligatures w14:val="none"/>
         </w:rPr>
         <w:t>Step-by-Step Guide to Choosing the Most Suitable BIPV Architecture</w:t>
@@ -30,15 +30,15 @@
         <w:rPr>
           <w:rFonts w:ascii="Times New Roman" w:eastAsia="Times New Roman" w:hAnsi="Times New Roman" w:cs="Times New Roman"/>
           <w:kern w:val="0"/>
-          <w:lang w:val="en-CH" w:eastAsia="en-CH"/>
-          <w14:ligatures w14:val="none"/>
-        </w:rPr>
-      </w:pPr>
-      <w:r>
-        <w:rPr>
-          <w:rFonts w:ascii="Times New Roman" w:eastAsia="Times New Roman" w:hAnsi="Times New Roman" w:cs="Times New Roman"/>
-          <w:kern w:val="0"/>
-          <w:lang w:val="en-CH" w:eastAsia="en-CH"/>
+          <w:lang w:eastAsia="en-CH"/>
+          <w14:ligatures w14:val="none"/>
+        </w:rPr>
+      </w:pPr>
+      <w:r>
+        <w:rPr>
+          <w:rFonts w:ascii="Times New Roman" w:eastAsia="Times New Roman" w:hAnsi="Times New Roman" w:cs="Times New Roman"/>
+          <w:kern w:val="0"/>
+          <w:lang w:eastAsia="en-CH"/>
           <w14:ligatures w14:val="none"/>
         </w:rPr>
         <w:t>Designing a photovoltaic system—especially for Building-Integrated Photovoltaics (BIPV) like Active Windows—requires a structured approach to balance energy harvest, safety, and cost. Here is a comprehensive, scratch-written methodology for selecting the ideal electrical connection topology.</w:t>
@@ -50,7 +50,7 @@
         <w:rPr>
           <w:rFonts w:ascii="Times New Roman" w:eastAsia="Times New Roman" w:hAnsi="Times New Roman" w:cs="Times New Roman"/>
           <w:kern w:val="0"/>
-          <w:lang w:val="en-CH" w:eastAsia="en-CH"/>
+          <w:lang w:eastAsia="en-CH"/>
           <w14:ligatures w14:val="none"/>
         </w:rPr>
       </w:pPr>
@@ -60,7 +60,7 @@
           <w:b/>
           <w:bCs/>
           <w:kern w:val="0"/>
-          <w:lang w:val="en-CH" w:eastAsia="en-CH"/>
+          <w:lang w:eastAsia="en-CH"/>
           <w14:ligatures w14:val="none"/>
         </w:rPr>
         <w:t>Step 1: Define the Project Scope and Load Profile</w:t>
@@ -69,30 +69,10 @@
         <w:rPr>
           <w:rFonts w:ascii="Times New Roman" w:eastAsia="Times New Roman" w:hAnsi="Times New Roman" w:cs="Times New Roman"/>
           <w:kern w:val="0"/>
-          <w:lang w:val="en-CH" w:eastAsia="en-CH"/>
-          <w14:ligatures w14:val="none"/>
-        </w:rPr>
-        <w:t xml:space="preserve"> Begin by clearly defining the core objectives of the installation. Ascertain whether the system will be grid-tied, standalone, or a hybrid AC/DC microgrid. For a grid-tied system, the primary goal is often maximizing the energy yield (kWh/</w:t>
-      </w:r>
-      <w:proofErr w:type="spellStart"/>
-      <w:r>
-        <w:rPr>
-          <w:rFonts w:ascii="Times New Roman" w:eastAsia="Times New Roman" w:hAnsi="Times New Roman" w:cs="Times New Roman"/>
-          <w:kern w:val="0"/>
-          <w:lang w:val="en-CH" w:eastAsia="en-CH"/>
-          <w14:ligatures w14:val="none"/>
-        </w:rPr>
-        <w:t>kWp</w:t>
-      </w:r>
-      <w:proofErr w:type="spellEnd"/>
-      <w:r>
-        <w:rPr>
-          <w:rFonts w:ascii="Times New Roman" w:eastAsia="Times New Roman" w:hAnsi="Times New Roman" w:cs="Times New Roman"/>
-          <w:kern w:val="0"/>
-          <w:lang w:val="en-CH" w:eastAsia="en-CH"/>
-          <w14:ligatures w14:val="none"/>
-        </w:rPr>
-        <w:t>) and utilizing the grid as a buffer, whereas standalone systems require careful load analysis to size battery storage adequately.</w:t>
+          <w:lang w:eastAsia="en-CH"/>
+          <w14:ligatures w14:val="none"/>
+        </w:rPr>
+        <w:t xml:space="preserve"> Begin by clearly defining the core objectives of the installation. Ascertain whether the system will be grid-tied, standalone, or a hybrid AC/DC microgrid. For a grid-tied system, the primary goal is often maximizing the energy yield (kWh/kWp) and utilizing the grid as a buffer, whereas standalone systems require careful load analysis to size battery storage adequately.</w:t>
       </w:r>
     </w:p>
     <w:p>
@@ -101,7 +81,7 @@
         <w:rPr>
           <w:rFonts w:ascii="Times New Roman" w:eastAsia="Times New Roman" w:hAnsi="Times New Roman" w:cs="Times New Roman"/>
           <w:kern w:val="0"/>
-          <w:lang w:val="en-CH" w:eastAsia="en-CH"/>
+          <w:lang w:eastAsia="en-CH"/>
           <w14:ligatures w14:val="none"/>
         </w:rPr>
       </w:pPr>
@@ -111,7 +91,7 @@
           <w:b/>
           <w:bCs/>
           <w:kern w:val="0"/>
-          <w:lang w:val="en-CH" w:eastAsia="en-CH"/>
+          <w:lang w:eastAsia="en-CH"/>
           <w14:ligatures w14:val="none"/>
         </w:rPr>
         <w:t>Step 2: Execute a Comprehensive Site and Shading Survey</w:t>
@@ -120,30 +100,10 @@
         <w:rPr>
           <w:rFonts w:ascii="Times New Roman" w:eastAsia="Times New Roman" w:hAnsi="Times New Roman" w:cs="Times New Roman"/>
           <w:kern w:val="0"/>
-          <w:lang w:val="en-CH" w:eastAsia="en-CH"/>
-          <w14:ligatures w14:val="none"/>
-        </w:rPr>
-        <w:t xml:space="preserve"> Because BIPV systems are integrated into building facades, they are highly susceptible to both near-field shading (from balconies, trees, or structural elements) and global/horizon shading (from </w:t>
-      </w:r>
-      <w:proofErr w:type="spellStart"/>
-      <w:r>
-        <w:rPr>
-          <w:rFonts w:ascii="Times New Roman" w:eastAsia="Times New Roman" w:hAnsi="Times New Roman" w:cs="Times New Roman"/>
-          <w:kern w:val="0"/>
-          <w:lang w:val="en-CH" w:eastAsia="en-CH"/>
-          <w14:ligatures w14:val="none"/>
-        </w:rPr>
-        <w:t>neighboring</w:t>
-      </w:r>
-      <w:proofErr w:type="spellEnd"/>
-      <w:r>
-        <w:rPr>
-          <w:rFonts w:ascii="Times New Roman" w:eastAsia="Times New Roman" w:hAnsi="Times New Roman" w:cs="Times New Roman"/>
-          <w:kern w:val="0"/>
-          <w:lang w:val="en-CH" w:eastAsia="en-CH"/>
-          <w14:ligatures w14:val="none"/>
-        </w:rPr>
-        <w:t xml:space="preserve"> buildings). Even if only a small percentage of a panel is shaded, power generation can drop by as much as 80% due to the series connection of cells. You must plot the sun's path across the sky throughout the year to identify the precise shading profile for the facade.</w:t>
+          <w:lang w:eastAsia="en-CH"/>
+          <w14:ligatures w14:val="none"/>
+        </w:rPr>
+        <w:t xml:space="preserve"> Because BIPV systems are integrated into building facades, they are highly susceptible to both near-field shading (from balconies, trees, or structural elements) and global/horizon shading (from neighboring buildings). Even if only a small percentage of a panel is shaded, power generation can drop by as much as 80% due to the series connection of cells. You must plot the sun's path across the sky throughout the year to identify the precise shading profile for the facade.</w:t>
       </w:r>
     </w:p>
     <w:p>
@@ -152,7 +112,7 @@
         <w:rPr>
           <w:rFonts w:ascii="Times New Roman" w:eastAsia="Times New Roman" w:hAnsi="Times New Roman" w:cs="Times New Roman"/>
           <w:kern w:val="0"/>
-          <w:lang w:val="en-CH" w:eastAsia="en-CH"/>
+          <w:lang w:eastAsia="en-CH"/>
           <w14:ligatures w14:val="none"/>
         </w:rPr>
       </w:pPr>
@@ -162,7 +122,7 @@
           <w:b/>
           <w:bCs/>
           <w:kern w:val="0"/>
-          <w:lang w:val="en-CH" w:eastAsia="en-CH"/>
+          <w:lang w:eastAsia="en-CH"/>
           <w14:ligatures w14:val="none"/>
         </w:rPr>
         <w:t>Step 3: Map the Viable Topologies</w:t>
@@ -171,7 +131,7 @@
         <w:rPr>
           <w:rFonts w:ascii="Times New Roman" w:eastAsia="Times New Roman" w:hAnsi="Times New Roman" w:cs="Times New Roman"/>
           <w:kern w:val="0"/>
-          <w:lang w:val="en-CH" w:eastAsia="en-CH"/>
+          <w:lang w:eastAsia="en-CH"/>
           <w14:ligatures w14:val="none"/>
         </w:rPr>
         <w:t xml:space="preserve"> Based on the project's scale, outline the potential electrical architectures. The main categories include:</w:t>
@@ -187,7 +147,7 @@
         <w:rPr>
           <w:rFonts w:ascii="Times New Roman" w:eastAsia="Times New Roman" w:hAnsi="Times New Roman" w:cs="Times New Roman"/>
           <w:kern w:val="0"/>
-          <w:lang w:val="en-CH" w:eastAsia="en-CH"/>
+          <w:lang w:eastAsia="en-CH"/>
           <w14:ligatures w14:val="none"/>
         </w:rPr>
       </w:pPr>
@@ -197,7 +157,7 @@
           <w:b/>
           <w:bCs/>
           <w:kern w:val="0"/>
-          <w:lang w:val="en-CH" w:eastAsia="en-CH"/>
+          <w:lang w:eastAsia="en-CH"/>
           <w14:ligatures w14:val="none"/>
         </w:rPr>
         <w:t>Centralized MPPT (CMPPT):</w:t>
@@ -206,7 +166,7 @@
         <w:rPr>
           <w:rFonts w:ascii="Times New Roman" w:eastAsia="Times New Roman" w:hAnsi="Times New Roman" w:cs="Times New Roman"/>
           <w:kern w:val="0"/>
-          <w:lang w:val="en-CH" w:eastAsia="en-CH"/>
+          <w:lang w:eastAsia="en-CH"/>
           <w14:ligatures w14:val="none"/>
         </w:rPr>
         <w:t xml:space="preserve"> Standard string systems where panels are wired in series to a single central inverter.</w:t>
@@ -222,7 +182,7 @@
         <w:rPr>
           <w:rFonts w:ascii="Times New Roman" w:eastAsia="Times New Roman" w:hAnsi="Times New Roman" w:cs="Times New Roman"/>
           <w:kern w:val="0"/>
-          <w:lang w:val="en-CH" w:eastAsia="en-CH"/>
+          <w:lang w:eastAsia="en-CH"/>
           <w14:ligatures w14:val="none"/>
         </w:rPr>
       </w:pPr>
@@ -232,7 +192,7 @@
           <w:b/>
           <w:bCs/>
           <w:kern w:val="0"/>
-          <w:lang w:val="en-CH" w:eastAsia="en-CH"/>
+          <w:lang w:eastAsia="en-CH"/>
           <w14:ligatures w14:val="none"/>
         </w:rPr>
         <w:t>Distributed MPPT (DMPPT) at the Module Level:</w:t>
@@ -241,7 +201,7 @@
         <w:rPr>
           <w:rFonts w:ascii="Times New Roman" w:eastAsia="Times New Roman" w:hAnsi="Times New Roman" w:cs="Times New Roman"/>
           <w:kern w:val="0"/>
-          <w:lang w:val="en-CH" w:eastAsia="en-CH"/>
+          <w:lang w:eastAsia="en-CH"/>
           <w14:ligatures w14:val="none"/>
         </w:rPr>
         <w:t xml:space="preserve"> This includes </w:t>
@@ -252,7 +212,7 @@
           <w:b/>
           <w:bCs/>
           <w:kern w:val="0"/>
-          <w:lang w:val="en-CH" w:eastAsia="en-CH"/>
+          <w:lang w:eastAsia="en-CH"/>
           <w14:ligatures w14:val="none"/>
         </w:rPr>
         <w:t>Microinverters</w:t>
@@ -261,7 +221,7 @@
         <w:rPr>
           <w:rFonts w:ascii="Times New Roman" w:eastAsia="Times New Roman" w:hAnsi="Times New Roman" w:cs="Times New Roman"/>
           <w:kern w:val="0"/>
-          <w:lang w:val="en-CH" w:eastAsia="en-CH"/>
+          <w:lang w:eastAsia="en-CH"/>
           <w14:ligatures w14:val="none"/>
         </w:rPr>
         <w:t xml:space="preserve"> (Module-Integrated Parallel Inverters) that convert DC to AC directly at the panel, or </w:t>
@@ -272,7 +232,7 @@
           <w:b/>
           <w:bCs/>
           <w:kern w:val="0"/>
-          <w:lang w:val="en-CH" w:eastAsia="en-CH"/>
+          <w:lang w:eastAsia="en-CH"/>
           <w14:ligatures w14:val="none"/>
         </w:rPr>
         <w:t>Power Optimizers</w:t>
@@ -281,7 +241,7 @@
         <w:rPr>
           <w:rFonts w:ascii="Times New Roman" w:eastAsia="Times New Roman" w:hAnsi="Times New Roman" w:cs="Times New Roman"/>
           <w:kern w:val="0"/>
-          <w:lang w:val="en-CH" w:eastAsia="en-CH"/>
+          <w:lang w:eastAsia="en-CH"/>
           <w14:ligatures w14:val="none"/>
         </w:rPr>
         <w:t xml:space="preserve"> (Module-Integrated Parallel/Series Converters) that regulate DC voltage at the panel level before sending it to a central inverter or DC bus.</w:t>
@@ -293,7 +253,7 @@
         <w:rPr>
           <w:rFonts w:ascii="Times New Roman" w:eastAsia="Times New Roman" w:hAnsi="Times New Roman" w:cs="Times New Roman"/>
           <w:kern w:val="0"/>
-          <w:lang w:val="en-CH" w:eastAsia="en-CH"/>
+          <w:lang w:eastAsia="en-CH"/>
           <w14:ligatures w14:val="none"/>
         </w:rPr>
       </w:pPr>
@@ -303,7 +263,7 @@
           <w:b/>
           <w:bCs/>
           <w:kern w:val="0"/>
-          <w:lang w:val="en-CH" w:eastAsia="en-CH"/>
+          <w:lang w:eastAsia="en-CH"/>
           <w14:ligatures w14:val="none"/>
         </w:rPr>
         <w:t>Step 4: Conduct Technical Benchmarking for Shading Tolerance</w:t>
@@ -312,7 +272,7 @@
         <w:rPr>
           <w:rFonts w:ascii="Times New Roman" w:eastAsia="Times New Roman" w:hAnsi="Times New Roman" w:cs="Times New Roman"/>
           <w:kern w:val="0"/>
-          <w:lang w:val="en-CH" w:eastAsia="en-CH"/>
+          <w:lang w:eastAsia="en-CH"/>
           <w14:ligatures w14:val="none"/>
         </w:rPr>
         <w:t xml:space="preserve"> Evaluate how each topology handles the shading mapped in Step 2. In a CMPPT string system, a single shaded module forces the entire string's current to drop, creating severe mismatch losses and potential "hot spots". If the facade experiences complex shading, you must pivot to a DMPPT architecture (microinverters or optimizers) so that each window operates independently, isolating the performance drop to only the shaded windows.</w:t>
@@ -324,7 +284,7 @@
         <w:rPr>
           <w:rFonts w:ascii="Times New Roman" w:eastAsia="Times New Roman" w:hAnsi="Times New Roman" w:cs="Times New Roman"/>
           <w:kern w:val="0"/>
-          <w:lang w:val="en-CH" w:eastAsia="en-CH"/>
+          <w:lang w:eastAsia="en-CH"/>
           <w14:ligatures w14:val="none"/>
         </w:rPr>
       </w:pPr>
@@ -334,7 +294,7 @@
           <w:b/>
           <w:bCs/>
           <w:kern w:val="0"/>
-          <w:lang w:val="en-CH" w:eastAsia="en-CH"/>
+          <w:lang w:eastAsia="en-CH"/>
           <w14:ligatures w14:val="none"/>
         </w:rPr>
         <w:t>Step 5: Perform a Multi-Criteria Decision Analysis (MCDA)</w:t>
@@ -343,7 +303,7 @@
         <w:rPr>
           <w:rFonts w:ascii="Times New Roman" w:eastAsia="Times New Roman" w:hAnsi="Times New Roman" w:cs="Times New Roman"/>
           <w:kern w:val="0"/>
-          <w:lang w:val="en-CH" w:eastAsia="en-CH"/>
+          <w:lang w:eastAsia="en-CH"/>
           <w14:ligatures w14:val="none"/>
         </w:rPr>
         <w:t xml:space="preserve"> Objectively evaluate the shortlisted topologies against strict project constraints:</w:t>
@@ -359,7 +319,7 @@
         <w:rPr>
           <w:rFonts w:ascii="Times New Roman" w:eastAsia="Times New Roman" w:hAnsi="Times New Roman" w:cs="Times New Roman"/>
           <w:kern w:val="0"/>
-          <w:lang w:val="en-CH" w:eastAsia="en-CH"/>
+          <w:lang w:eastAsia="en-CH"/>
           <w14:ligatures w14:val="none"/>
         </w:rPr>
       </w:pPr>
@@ -369,7 +329,7 @@
           <w:b/>
           <w:bCs/>
           <w:kern w:val="0"/>
-          <w:lang w:val="en-CH" w:eastAsia="en-CH"/>
+          <w:lang w:eastAsia="en-CH"/>
           <w14:ligatures w14:val="none"/>
         </w:rPr>
         <w:t>Electrical Safety:</w:t>
@@ -378,7 +338,7 @@
         <w:rPr>
           <w:rFonts w:ascii="Times New Roman" w:eastAsia="Times New Roman" w:hAnsi="Times New Roman" w:cs="Times New Roman"/>
           <w:kern w:val="0"/>
-          <w:lang w:val="en-CH" w:eastAsia="en-CH"/>
+          <w:lang w:eastAsia="en-CH"/>
           <w14:ligatures w14:val="none"/>
         </w:rPr>
         <w:t xml:space="preserve"> High-voltage DC strings in building facades pose a severe fire hazard from electric arcs that do not self-extinguish. Architectures utilizing module-level power electronics or a "DC bus per floor" can limit system voltage and mitigate these risks.</w:t>
@@ -394,7 +354,7 @@
         <w:rPr>
           <w:rFonts w:ascii="Times New Roman" w:eastAsia="Times New Roman" w:hAnsi="Times New Roman" w:cs="Times New Roman"/>
           <w:kern w:val="0"/>
-          <w:lang w:val="en-CH" w:eastAsia="en-CH"/>
+          <w:lang w:eastAsia="en-CH"/>
           <w14:ligatures w14:val="none"/>
         </w:rPr>
       </w:pPr>
@@ -404,7 +364,7 @@
           <w:b/>
           <w:bCs/>
           <w:kern w:val="0"/>
-          <w:lang w:val="en-CH" w:eastAsia="en-CH"/>
+          <w:lang w:eastAsia="en-CH"/>
           <w14:ligatures w14:val="none"/>
         </w:rPr>
         <w:t>Reliability:</w:t>
@@ -413,7 +373,7 @@
         <w:rPr>
           <w:rFonts w:ascii="Times New Roman" w:eastAsia="Times New Roman" w:hAnsi="Times New Roman" w:cs="Times New Roman"/>
           <w:kern w:val="0"/>
-          <w:lang w:val="en-CH" w:eastAsia="en-CH"/>
+          <w:lang w:eastAsia="en-CH"/>
           <w14:ligatures w14:val="none"/>
         </w:rPr>
         <w:t xml:space="preserve"> Distributed electronics (like microinverters) place sensitive components in harsh, high-temperature facade environments, which can shorten their lifespan.</w:t>
@@ -429,7 +389,7 @@
         <w:rPr>
           <w:rFonts w:ascii="Times New Roman" w:eastAsia="Times New Roman" w:hAnsi="Times New Roman" w:cs="Times New Roman"/>
           <w:kern w:val="0"/>
-          <w:lang w:val="en-CH" w:eastAsia="en-CH"/>
+          <w:lang w:eastAsia="en-CH"/>
           <w14:ligatures w14:val="none"/>
         </w:rPr>
       </w:pPr>
@@ -439,7 +399,7 @@
           <w:b/>
           <w:bCs/>
           <w:kern w:val="0"/>
-          <w:lang w:val="en-CH" w:eastAsia="en-CH"/>
+          <w:lang w:eastAsia="en-CH"/>
           <w14:ligatures w14:val="none"/>
         </w:rPr>
         <w:t>Economics:</w:t>
@@ -448,7 +408,7 @@
         <w:rPr>
           <w:rFonts w:ascii="Times New Roman" w:eastAsia="Times New Roman" w:hAnsi="Times New Roman" w:cs="Times New Roman"/>
           <w:kern w:val="0"/>
-          <w:lang w:val="en-CH" w:eastAsia="en-CH"/>
+          <w:lang w:eastAsia="en-CH"/>
           <w14:ligatures w14:val="none"/>
         </w:rPr>
         <w:t xml:space="preserve"> Balance the higher capital expenditure (CAPEX) and wiring complexity of distributed systems against the long-term energy yield gains.</w:t>
@@ -460,7 +420,7 @@
         <w:rPr>
           <w:rFonts w:ascii="Times New Roman" w:eastAsia="Times New Roman" w:hAnsi="Times New Roman" w:cs="Times New Roman"/>
           <w:kern w:val="0"/>
-          <w:lang w:val="en-CH" w:eastAsia="en-CH"/>
+          <w:lang w:eastAsia="en-CH"/>
           <w14:ligatures w14:val="none"/>
         </w:rPr>
       </w:pPr>
@@ -470,7 +430,7 @@
           <w:b/>
           <w:bCs/>
           <w:kern w:val="0"/>
-          <w:lang w:val="en-CH" w:eastAsia="en-CH"/>
+          <w:lang w:eastAsia="en-CH"/>
           <w14:ligatures w14:val="none"/>
         </w:rPr>
         <w:lastRenderedPageBreak/>
@@ -480,7 +440,7 @@
         <w:rPr>
           <w:rFonts w:ascii="Times New Roman" w:eastAsia="Times New Roman" w:hAnsi="Times New Roman" w:cs="Times New Roman"/>
           <w:kern w:val="0"/>
-          <w:lang w:val="en-CH" w:eastAsia="en-CH"/>
+          <w:lang w:eastAsia="en-CH"/>
           <w14:ligatures w14:val="none"/>
         </w:rPr>
         <w:t xml:space="preserve"> Ensure the chosen architecture complies with international and local building codes. This includes the National Electrical Code (NEC) Article 690 for PV systems, IEC standards for inverter safety (like IEC 62109), and vital safety functions like anti-islanding protection (UL 1741) to ensure the system safely disconnects during a power outage.</w:t>
@@ -492,7 +452,7 @@
         <w:rPr>
           <w:rFonts w:ascii="Times New Roman" w:eastAsia="Times New Roman" w:hAnsi="Times New Roman" w:cs="Times New Roman"/>
           <w:kern w:val="0"/>
-          <w:lang w:val="en-CH" w:eastAsia="en-CH"/>
+          <w:lang w:eastAsia="en-CH"/>
           <w14:ligatures w14:val="none"/>
         </w:rPr>
       </w:pPr>
@@ -502,7 +462,7 @@
           <w:b/>
           <w:bCs/>
           <w:kern w:val="0"/>
-          <w:lang w:val="en-CH" w:eastAsia="en-CH"/>
+          <w:lang w:eastAsia="en-CH"/>
           <w14:ligatures w14:val="none"/>
         </w:rPr>
         <w:t>Step 7: Draft the Technical Requirements Specification (TRS)</w:t>
@@ -511,7 +471,7 @@
         <w:rPr>
           <w:rFonts w:ascii="Times New Roman" w:eastAsia="Times New Roman" w:hAnsi="Times New Roman" w:cs="Times New Roman"/>
           <w:kern w:val="0"/>
-          <w:lang w:val="en-CH" w:eastAsia="en-CH"/>
+          <w:lang w:eastAsia="en-CH"/>
           <w14:ligatures w14:val="none"/>
         </w:rPr>
         <w:t xml:space="preserve"> Finalize the selection and document the engineering baseline. This document must define the </w:t>
@@ -522,7 +482,7 @@
           <w:b/>
           <w:bCs/>
           <w:kern w:val="0"/>
-          <w:lang w:val="en-CH" w:eastAsia="en-CH"/>
+          <w:lang w:eastAsia="en-CH"/>
           <w14:ligatures w14:val="none"/>
         </w:rPr>
         <w:t>voltage levels, specific connector standards, wiring topology, Building Management System (BMS) integration protocols, and the real-time monitoring architecture</w:t>
@@ -531,7 +491,7 @@
         <w:rPr>
           <w:rFonts w:ascii="Times New Roman" w:eastAsia="Times New Roman" w:hAnsi="Times New Roman" w:cs="Times New Roman"/>
           <w:kern w:val="0"/>
-          <w:lang w:val="en-CH" w:eastAsia="en-CH"/>
+          <w:lang w:eastAsia="en-CH"/>
           <w14:ligatures w14:val="none"/>
         </w:rPr>
         <w:t xml:space="preserve"> required for the chosen system.</w:t>
@@ -543,19 +503,19 @@
         <w:rPr>
           <w:rFonts w:ascii="Times New Roman" w:eastAsia="Times New Roman" w:hAnsi="Times New Roman" w:cs="Times New Roman"/>
           <w:kern w:val="0"/>
-          <w:lang w:val="en-CH" w:eastAsia="en-CH"/>
-          <w14:ligatures w14:val="none"/>
-        </w:rPr>
-      </w:pPr>
-      <w:r>
-        <w:rPr>
-          <w:rFonts w:ascii="Times New Roman" w:eastAsia="Times New Roman" w:hAnsi="Times New Roman" w:cs="Times New Roman"/>
-          <w:kern w:val="0"/>
-          <w:lang w:val="en-CH" w:eastAsia="en-CH"/>
+          <w:lang w:eastAsia="en-CH"/>
+          <w14:ligatures w14:val="none"/>
+        </w:rPr>
+      </w:pPr>
+      <w:r>
+        <w:rPr>
+          <w:rFonts w:ascii="Times New Roman" w:eastAsia="Times New Roman" w:hAnsi="Times New Roman" w:cs="Times New Roman"/>
+          <w:kern w:val="0"/>
+          <w:lang w:eastAsia="en-CH"/>
           <w14:ligatures w14:val="none"/>
         </w:rPr>
         <w:pict w14:anchorId="5DFAFBEE">
-          <v:rect id="_x0000_i1031" style="width:0;height:1.5pt" o:hralign="center" o:hrstd="t" o:hr="t" fillcolor="#a0a0a0" stroked="f"/>
+          <v:rect id="_x0000_i1025" style="width:0;height:1.5pt" o:hralign="center" o:hrstd="t" o:hr="t" fillcolor="#a0a0a0" stroked="f"/>
         </w:pict>
       </w:r>
     </w:p>
@@ -565,7 +525,7 @@
         <w:rPr>
           <w:rFonts w:ascii="Times New Roman" w:eastAsia="Times New Roman" w:hAnsi="Times New Roman" w:cs="Times New Roman"/>
           <w:kern w:val="0"/>
-          <w:lang w:val="en-CH" w:eastAsia="en-CH"/>
+          <w:lang w:eastAsia="en-CH"/>
           <w14:ligatures w14:val="none"/>
         </w:rPr>
       </w:pPr>
@@ -575,7 +535,7 @@
           <w:b/>
           <w:bCs/>
           <w:kern w:val="0"/>
-          <w:lang w:val="en-CH" w:eastAsia="en-CH"/>
+          <w:lang w:eastAsia="en-CH"/>
           <w14:ligatures w14:val="none"/>
         </w:rPr>
         <w:t>Architecture Selection Checklist</w:t>
@@ -587,7 +547,7 @@
         <w:rPr>
           <w:rFonts w:ascii="Times New Roman" w:eastAsia="Times New Roman" w:hAnsi="Times New Roman" w:cs="Times New Roman"/>
           <w:kern w:val="0"/>
-          <w:lang w:val="en-CH" w:eastAsia="en-CH"/>
+          <w:lang w:eastAsia="en-CH"/>
           <w14:ligatures w14:val="none"/>
         </w:rPr>
       </w:pPr>
@@ -597,7 +557,7 @@
           <w:b/>
           <w:bCs/>
           <w:kern w:val="0"/>
-          <w:lang w:val="en-CH" w:eastAsia="en-CH"/>
+          <w:lang w:eastAsia="en-CH"/>
           <w14:ligatures w14:val="none"/>
         </w:rPr>
         <w:t>1. Site &amp; Shading Analysis</w:t>
@@ -613,29 +573,18 @@
         <w:rPr>
           <w:rFonts w:ascii="Times New Roman" w:eastAsia="Times New Roman" w:hAnsi="Times New Roman" w:cs="Times New Roman"/>
           <w:kern w:val="0"/>
-          <w:lang w:val="en-CH" w:eastAsia="en-CH"/>
-          <w14:ligatures w14:val="none"/>
-        </w:rPr>
-      </w:pPr>
-      <w:proofErr w:type="gramStart"/>
-      <w:r>
-        <w:rPr>
-          <w:rFonts w:ascii="Times New Roman" w:eastAsia="Times New Roman" w:hAnsi="Times New Roman" w:cs="Times New Roman"/>
-          <w:kern w:val="0"/>
-          <w:lang w:val="en-CH" w:eastAsia="en-CH"/>
-          <w14:ligatures w14:val="none"/>
-        </w:rPr>
-        <w:t>[ ]</w:t>
-      </w:r>
-      <w:proofErr w:type="gramEnd"/>
-      <w:r>
-        <w:rPr>
-          <w:rFonts w:ascii="Times New Roman" w:eastAsia="Times New Roman" w:hAnsi="Times New Roman" w:cs="Times New Roman"/>
-          <w:kern w:val="0"/>
-          <w:lang w:val="en-CH" w:eastAsia="en-CH"/>
-          <w14:ligatures w14:val="none"/>
-        </w:rPr>
-        <w:t xml:space="preserve"> Has a detailed shading analysis (near-field and horizon) been completed?</w:t>
+          <w:lang w:eastAsia="en-CH"/>
+          <w14:ligatures w14:val="none"/>
+        </w:rPr>
+      </w:pPr>
+      <w:r>
+        <w:rPr>
+          <w:rFonts w:ascii="Times New Roman" w:eastAsia="Times New Roman" w:hAnsi="Times New Roman" w:cs="Times New Roman"/>
+          <w:kern w:val="0"/>
+          <w:lang w:eastAsia="en-CH"/>
+          <w14:ligatures w14:val="none"/>
+        </w:rPr>
+        <w:t>[ ] Has a detailed shading analysis (near-field and horizon) been completed?</w:t>
       </w:r>
     </w:p>
     <w:p>
@@ -648,29 +597,18 @@
         <w:rPr>
           <w:rFonts w:ascii="Times New Roman" w:eastAsia="Times New Roman" w:hAnsi="Times New Roman" w:cs="Times New Roman"/>
           <w:kern w:val="0"/>
-          <w:lang w:val="en-CH" w:eastAsia="en-CH"/>
-          <w14:ligatures w14:val="none"/>
-        </w:rPr>
-      </w:pPr>
-      <w:proofErr w:type="gramStart"/>
-      <w:r>
-        <w:rPr>
-          <w:rFonts w:ascii="Times New Roman" w:eastAsia="Times New Roman" w:hAnsi="Times New Roman" w:cs="Times New Roman"/>
-          <w:kern w:val="0"/>
-          <w:lang w:val="en-CH" w:eastAsia="en-CH"/>
-          <w14:ligatures w14:val="none"/>
-        </w:rPr>
-        <w:t>[ ]</w:t>
-      </w:r>
-      <w:proofErr w:type="gramEnd"/>
-      <w:r>
-        <w:rPr>
-          <w:rFonts w:ascii="Times New Roman" w:eastAsia="Times New Roman" w:hAnsi="Times New Roman" w:cs="Times New Roman"/>
-          <w:kern w:val="0"/>
-          <w:lang w:val="en-CH" w:eastAsia="en-CH"/>
-          <w14:ligatures w14:val="none"/>
-        </w:rPr>
-        <w:t xml:space="preserve"> Have the orientation and tilt (or vertical facade angle) been factored into the energy yield calculations?</w:t>
+          <w:lang w:eastAsia="en-CH"/>
+          <w14:ligatures w14:val="none"/>
+        </w:rPr>
+      </w:pPr>
+      <w:r>
+        <w:rPr>
+          <w:rFonts w:ascii="Times New Roman" w:eastAsia="Times New Roman" w:hAnsi="Times New Roman" w:cs="Times New Roman"/>
+          <w:kern w:val="0"/>
+          <w:lang w:eastAsia="en-CH"/>
+          <w14:ligatures w14:val="none"/>
+        </w:rPr>
+        <w:t>[ ] Have the orientation and tilt (or vertical facade angle) been factored into the energy yield calculations?</w:t>
       </w:r>
     </w:p>
     <w:p>
@@ -683,29 +621,18 @@
         <w:rPr>
           <w:rFonts w:ascii="Times New Roman" w:eastAsia="Times New Roman" w:hAnsi="Times New Roman" w:cs="Times New Roman"/>
           <w:kern w:val="0"/>
-          <w:lang w:val="en-CH" w:eastAsia="en-CH"/>
-          <w14:ligatures w14:val="none"/>
-        </w:rPr>
-      </w:pPr>
-      <w:proofErr w:type="gramStart"/>
-      <w:r>
-        <w:rPr>
-          <w:rFonts w:ascii="Times New Roman" w:eastAsia="Times New Roman" w:hAnsi="Times New Roman" w:cs="Times New Roman"/>
-          <w:kern w:val="0"/>
-          <w:lang w:val="en-CH" w:eastAsia="en-CH"/>
-          <w14:ligatures w14:val="none"/>
-        </w:rPr>
-        <w:t>[ ]</w:t>
-      </w:r>
-      <w:proofErr w:type="gramEnd"/>
-      <w:r>
-        <w:rPr>
-          <w:rFonts w:ascii="Times New Roman" w:eastAsia="Times New Roman" w:hAnsi="Times New Roman" w:cs="Times New Roman"/>
-          <w:kern w:val="0"/>
-          <w:lang w:val="en-CH" w:eastAsia="en-CH"/>
-          <w14:ligatures w14:val="none"/>
-        </w:rPr>
-        <w:t xml:space="preserve"> Is the shading severe enough to mandate a Distributed MPPT (DMPPT) architecture?</w:t>
+          <w:lang w:eastAsia="en-CH"/>
+          <w14:ligatures w14:val="none"/>
+        </w:rPr>
+      </w:pPr>
+      <w:r>
+        <w:rPr>
+          <w:rFonts w:ascii="Times New Roman" w:eastAsia="Times New Roman" w:hAnsi="Times New Roman" w:cs="Times New Roman"/>
+          <w:kern w:val="0"/>
+          <w:lang w:eastAsia="en-CH"/>
+          <w14:ligatures w14:val="none"/>
+        </w:rPr>
+        <w:t>[ ] Is the shading severe enough to mandate a Distributed MPPT (DMPPT) architecture?</w:t>
       </w:r>
     </w:p>
     <w:p>
@@ -714,7 +641,7 @@
         <w:rPr>
           <w:rFonts w:ascii="Times New Roman" w:eastAsia="Times New Roman" w:hAnsi="Times New Roman" w:cs="Times New Roman"/>
           <w:kern w:val="0"/>
-          <w:lang w:val="en-CH" w:eastAsia="en-CH"/>
+          <w:lang w:eastAsia="en-CH"/>
           <w14:ligatures w14:val="none"/>
         </w:rPr>
       </w:pPr>
@@ -724,7 +651,7 @@
           <w:b/>
           <w:bCs/>
           <w:kern w:val="0"/>
-          <w:lang w:val="en-CH" w:eastAsia="en-CH"/>
+          <w:lang w:eastAsia="en-CH"/>
           <w14:ligatures w14:val="none"/>
         </w:rPr>
         <w:t>2. Electrical Configuration</w:t>
@@ -740,29 +667,18 @@
         <w:rPr>
           <w:rFonts w:ascii="Times New Roman" w:eastAsia="Times New Roman" w:hAnsi="Times New Roman" w:cs="Times New Roman"/>
           <w:kern w:val="0"/>
-          <w:lang w:val="en-CH" w:eastAsia="en-CH"/>
-          <w14:ligatures w14:val="none"/>
-        </w:rPr>
-      </w:pPr>
-      <w:proofErr w:type="gramStart"/>
-      <w:r>
-        <w:rPr>
-          <w:rFonts w:ascii="Times New Roman" w:eastAsia="Times New Roman" w:hAnsi="Times New Roman" w:cs="Times New Roman"/>
-          <w:kern w:val="0"/>
-          <w:lang w:val="en-CH" w:eastAsia="en-CH"/>
-          <w14:ligatures w14:val="none"/>
-        </w:rPr>
-        <w:t>[ ]</w:t>
-      </w:r>
-      <w:proofErr w:type="gramEnd"/>
-      <w:r>
-        <w:rPr>
-          <w:rFonts w:ascii="Times New Roman" w:eastAsia="Times New Roman" w:hAnsi="Times New Roman" w:cs="Times New Roman"/>
-          <w:kern w:val="0"/>
-          <w:lang w:val="en-CH" w:eastAsia="en-CH"/>
-          <w14:ligatures w14:val="none"/>
-        </w:rPr>
-        <w:t xml:space="preserve"> Is the system grid-tied, off-grid, or utilizing a hybrid AC/DC microgrid?</w:t>
+          <w:lang w:eastAsia="en-CH"/>
+          <w14:ligatures w14:val="none"/>
+        </w:rPr>
+      </w:pPr>
+      <w:r>
+        <w:rPr>
+          <w:rFonts w:ascii="Times New Roman" w:eastAsia="Times New Roman" w:hAnsi="Times New Roman" w:cs="Times New Roman"/>
+          <w:kern w:val="0"/>
+          <w:lang w:eastAsia="en-CH"/>
+          <w14:ligatures w14:val="none"/>
+        </w:rPr>
+        <w:t>[ ] Is the system grid-tied, off-grid, or utilizing a hybrid AC/DC microgrid?</w:t>
       </w:r>
     </w:p>
     <w:p>
@@ -775,29 +691,18 @@
         <w:rPr>
           <w:rFonts w:ascii="Times New Roman" w:eastAsia="Times New Roman" w:hAnsi="Times New Roman" w:cs="Times New Roman"/>
           <w:kern w:val="0"/>
-          <w:lang w:val="en-CH" w:eastAsia="en-CH"/>
-          <w14:ligatures w14:val="none"/>
-        </w:rPr>
-      </w:pPr>
-      <w:proofErr w:type="gramStart"/>
-      <w:r>
-        <w:rPr>
-          <w:rFonts w:ascii="Times New Roman" w:eastAsia="Times New Roman" w:hAnsi="Times New Roman" w:cs="Times New Roman"/>
-          <w:kern w:val="0"/>
-          <w:lang w:val="en-CH" w:eastAsia="en-CH"/>
-          <w14:ligatures w14:val="none"/>
-        </w:rPr>
-        <w:t>[ ]</w:t>
-      </w:r>
-      <w:proofErr w:type="gramEnd"/>
-      <w:r>
-        <w:rPr>
-          <w:rFonts w:ascii="Times New Roman" w:eastAsia="Times New Roman" w:hAnsi="Times New Roman" w:cs="Times New Roman"/>
-          <w:kern w:val="0"/>
-          <w:lang w:val="en-CH" w:eastAsia="en-CH"/>
-          <w14:ligatures w14:val="none"/>
-        </w:rPr>
-        <w:t xml:space="preserve"> What are the maximum allowable DC voltage limits for the building facade?</w:t>
+          <w:lang w:eastAsia="en-CH"/>
+          <w14:ligatures w14:val="none"/>
+        </w:rPr>
+      </w:pPr>
+      <w:r>
+        <w:rPr>
+          <w:rFonts w:ascii="Times New Roman" w:eastAsia="Times New Roman" w:hAnsi="Times New Roman" w:cs="Times New Roman"/>
+          <w:kern w:val="0"/>
+          <w:lang w:eastAsia="en-CH"/>
+          <w14:ligatures w14:val="none"/>
+        </w:rPr>
+        <w:t>[ ] What are the maximum allowable DC voltage limits for the building facade?</w:t>
       </w:r>
     </w:p>
     <w:p>
@@ -806,7 +711,7 @@
         <w:rPr>
           <w:rFonts w:ascii="Times New Roman" w:eastAsia="Times New Roman" w:hAnsi="Times New Roman" w:cs="Times New Roman"/>
           <w:kern w:val="0"/>
-          <w:lang w:val="en-CH" w:eastAsia="en-CH"/>
+          <w:lang w:eastAsia="en-CH"/>
           <w14:ligatures w14:val="none"/>
         </w:rPr>
       </w:pPr>
@@ -816,7 +721,7 @@
           <w:b/>
           <w:bCs/>
           <w:kern w:val="0"/>
-          <w:lang w:val="en-CH" w:eastAsia="en-CH"/>
+          <w:lang w:eastAsia="en-CH"/>
           <w14:ligatures w14:val="none"/>
         </w:rPr>
         <w:t>3. Topology Evaluation (MCDA)</w:t>
@@ -832,29 +737,18 @@
         <w:rPr>
           <w:rFonts w:ascii="Times New Roman" w:eastAsia="Times New Roman" w:hAnsi="Times New Roman" w:cs="Times New Roman"/>
           <w:kern w:val="0"/>
-          <w:lang w:val="en-CH" w:eastAsia="en-CH"/>
-          <w14:ligatures w14:val="none"/>
-        </w:rPr>
-      </w:pPr>
-      <w:proofErr w:type="gramStart"/>
-      <w:r>
-        <w:rPr>
-          <w:rFonts w:ascii="Times New Roman" w:eastAsia="Times New Roman" w:hAnsi="Times New Roman" w:cs="Times New Roman"/>
-          <w:kern w:val="0"/>
-          <w:lang w:val="en-CH" w:eastAsia="en-CH"/>
-          <w14:ligatures w14:val="none"/>
-        </w:rPr>
-        <w:t>[ ]</w:t>
-      </w:r>
-      <w:proofErr w:type="gramEnd"/>
-      <w:r>
-        <w:rPr>
-          <w:rFonts w:ascii="Times New Roman" w:eastAsia="Times New Roman" w:hAnsi="Times New Roman" w:cs="Times New Roman"/>
-          <w:kern w:val="0"/>
-          <w:lang w:val="en-CH" w:eastAsia="en-CH"/>
-          <w14:ligatures w14:val="none"/>
-        </w:rPr>
-        <w:t xml:space="preserve"> </w:t>
+          <w:lang w:eastAsia="en-CH"/>
+          <w14:ligatures w14:val="none"/>
+        </w:rPr>
+      </w:pPr>
+      <w:r>
+        <w:rPr>
+          <w:rFonts w:ascii="Times New Roman" w:eastAsia="Times New Roman" w:hAnsi="Times New Roman" w:cs="Times New Roman"/>
+          <w:kern w:val="0"/>
+          <w:lang w:eastAsia="en-CH"/>
+          <w14:ligatures w14:val="none"/>
+        </w:rPr>
+        <w:t xml:space="preserve">[ ] </w:t>
       </w:r>
       <w:r>
         <w:rPr>
@@ -862,7 +756,7 @@
           <w:b/>
           <w:bCs/>
           <w:kern w:val="0"/>
-          <w:lang w:val="en-CH" w:eastAsia="en-CH"/>
+          <w:lang w:eastAsia="en-CH"/>
           <w14:ligatures w14:val="none"/>
         </w:rPr>
         <w:t>CMPPT (String Inverter):</w:t>
@@ -871,7 +765,7 @@
         <w:rPr>
           <w:rFonts w:ascii="Times New Roman" w:eastAsia="Times New Roman" w:hAnsi="Times New Roman" w:cs="Times New Roman"/>
           <w:kern w:val="0"/>
-          <w:lang w:val="en-CH" w:eastAsia="en-CH"/>
+          <w:lang w:eastAsia="en-CH"/>
           <w14:ligatures w14:val="none"/>
         </w:rPr>
         <w:t xml:space="preserve"> Ruled out if partial shading or high-voltage DC routing in the facade is an issue?</w:t>
@@ -887,29 +781,18 @@
         <w:rPr>
           <w:rFonts w:ascii="Times New Roman" w:eastAsia="Times New Roman" w:hAnsi="Times New Roman" w:cs="Times New Roman"/>
           <w:kern w:val="0"/>
-          <w:lang w:val="en-CH" w:eastAsia="en-CH"/>
-          <w14:ligatures w14:val="none"/>
-        </w:rPr>
-      </w:pPr>
-      <w:proofErr w:type="gramStart"/>
-      <w:r>
-        <w:rPr>
-          <w:rFonts w:ascii="Times New Roman" w:eastAsia="Times New Roman" w:hAnsi="Times New Roman" w:cs="Times New Roman"/>
-          <w:kern w:val="0"/>
-          <w:lang w:val="en-CH" w:eastAsia="en-CH"/>
-          <w14:ligatures w14:val="none"/>
-        </w:rPr>
-        <w:t>[ ]</w:t>
-      </w:r>
-      <w:proofErr w:type="gramEnd"/>
-      <w:r>
-        <w:rPr>
-          <w:rFonts w:ascii="Times New Roman" w:eastAsia="Times New Roman" w:hAnsi="Times New Roman" w:cs="Times New Roman"/>
-          <w:kern w:val="0"/>
-          <w:lang w:val="en-CH" w:eastAsia="en-CH"/>
-          <w14:ligatures w14:val="none"/>
-        </w:rPr>
-        <w:t xml:space="preserve"> </w:t>
+          <w:lang w:eastAsia="en-CH"/>
+          <w14:ligatures w14:val="none"/>
+        </w:rPr>
+      </w:pPr>
+      <w:r>
+        <w:rPr>
+          <w:rFonts w:ascii="Times New Roman" w:eastAsia="Times New Roman" w:hAnsi="Times New Roman" w:cs="Times New Roman"/>
+          <w:kern w:val="0"/>
+          <w:lang w:eastAsia="en-CH"/>
+          <w14:ligatures w14:val="none"/>
+        </w:rPr>
+        <w:t xml:space="preserve">[ ] </w:t>
       </w:r>
       <w:r>
         <w:rPr>
@@ -917,7 +800,7 @@
           <w:b/>
           <w:bCs/>
           <w:kern w:val="0"/>
-          <w:lang w:val="en-CH" w:eastAsia="en-CH"/>
+          <w:lang w:eastAsia="en-CH"/>
           <w14:ligatures w14:val="none"/>
         </w:rPr>
         <w:t>MIPI (Microinverters):</w:t>
@@ -926,7 +809,7 @@
         <w:rPr>
           <w:rFonts w:ascii="Times New Roman" w:eastAsia="Times New Roman" w:hAnsi="Times New Roman" w:cs="Times New Roman"/>
           <w:kern w:val="0"/>
-          <w:lang w:val="en-CH" w:eastAsia="en-CH"/>
+          <w:lang w:eastAsia="en-CH"/>
           <w14:ligatures w14:val="none"/>
         </w:rPr>
         <w:t xml:space="preserve"> Selected if modularity, AC safety, and individual panel tracking are prioritized, and higher CAPEX is acceptable?</w:t>
@@ -942,29 +825,18 @@
         <w:rPr>
           <w:rFonts w:ascii="Times New Roman" w:eastAsia="Times New Roman" w:hAnsi="Times New Roman" w:cs="Times New Roman"/>
           <w:kern w:val="0"/>
-          <w:lang w:val="en-CH" w:eastAsia="en-CH"/>
-          <w14:ligatures w14:val="none"/>
-        </w:rPr>
-      </w:pPr>
-      <w:proofErr w:type="gramStart"/>
-      <w:r>
-        <w:rPr>
-          <w:rFonts w:ascii="Times New Roman" w:eastAsia="Times New Roman" w:hAnsi="Times New Roman" w:cs="Times New Roman"/>
-          <w:kern w:val="0"/>
-          <w:lang w:val="en-CH" w:eastAsia="en-CH"/>
-          <w14:ligatures w14:val="none"/>
-        </w:rPr>
-        <w:t>[ ]</w:t>
-      </w:r>
-      <w:proofErr w:type="gramEnd"/>
-      <w:r>
-        <w:rPr>
-          <w:rFonts w:ascii="Times New Roman" w:eastAsia="Times New Roman" w:hAnsi="Times New Roman" w:cs="Times New Roman"/>
-          <w:kern w:val="0"/>
-          <w:lang w:val="en-CH" w:eastAsia="en-CH"/>
-          <w14:ligatures w14:val="none"/>
-        </w:rPr>
-        <w:t xml:space="preserve"> </w:t>
+          <w:lang w:eastAsia="en-CH"/>
+          <w14:ligatures w14:val="none"/>
+        </w:rPr>
+      </w:pPr>
+      <w:r>
+        <w:rPr>
+          <w:rFonts w:ascii="Times New Roman" w:eastAsia="Times New Roman" w:hAnsi="Times New Roman" w:cs="Times New Roman"/>
+          <w:kern w:val="0"/>
+          <w:lang w:eastAsia="en-CH"/>
+          <w14:ligatures w14:val="none"/>
+        </w:rPr>
+        <w:t xml:space="preserve">[ ] </w:t>
       </w:r>
       <w:r>
         <w:rPr>
@@ -972,7 +844,7 @@
           <w:b/>
           <w:bCs/>
           <w:kern w:val="0"/>
-          <w:lang w:val="en-CH" w:eastAsia="en-CH"/>
+          <w:lang w:eastAsia="en-CH"/>
           <w14:ligatures w14:val="none"/>
         </w:rPr>
         <w:t>MIPC/MISC (Power Optimizers):</w:t>
@@ -981,7 +853,7 @@
         <w:rPr>
           <w:rFonts w:ascii="Times New Roman" w:eastAsia="Times New Roman" w:hAnsi="Times New Roman" w:cs="Times New Roman"/>
           <w:kern w:val="0"/>
-          <w:lang w:val="en-CH" w:eastAsia="en-CH"/>
+          <w:lang w:eastAsia="en-CH"/>
           <w14:ligatures w14:val="none"/>
         </w:rPr>
         <w:t xml:space="preserve"> Selected if utilizing a DC-bus-per-floor approach or integrating with DC battery storage?</w:t>
@@ -993,7 +865,7 @@
         <w:rPr>
           <w:rFonts w:ascii="Times New Roman" w:eastAsia="Times New Roman" w:hAnsi="Times New Roman" w:cs="Times New Roman"/>
           <w:kern w:val="0"/>
-          <w:lang w:val="en-CH" w:eastAsia="en-CH"/>
+          <w:lang w:eastAsia="en-CH"/>
           <w14:ligatures w14:val="none"/>
         </w:rPr>
       </w:pPr>
@@ -1003,7 +875,7 @@
           <w:b/>
           <w:bCs/>
           <w:kern w:val="0"/>
-          <w:lang w:val="en-CH" w:eastAsia="en-CH"/>
+          <w:lang w:eastAsia="en-CH"/>
           <w14:ligatures w14:val="none"/>
         </w:rPr>
         <w:t>4. Safety &amp; Regulatory Compliance</w:t>
@@ -1019,29 +891,18 @@
         <w:rPr>
           <w:rFonts w:ascii="Times New Roman" w:eastAsia="Times New Roman" w:hAnsi="Times New Roman" w:cs="Times New Roman"/>
           <w:kern w:val="0"/>
-          <w:lang w:val="en-CH" w:eastAsia="en-CH"/>
-          <w14:ligatures w14:val="none"/>
-        </w:rPr>
-      </w:pPr>
-      <w:proofErr w:type="gramStart"/>
-      <w:r>
-        <w:rPr>
-          <w:rFonts w:ascii="Times New Roman" w:eastAsia="Times New Roman" w:hAnsi="Times New Roman" w:cs="Times New Roman"/>
-          <w:kern w:val="0"/>
-          <w:lang w:val="en-CH" w:eastAsia="en-CH"/>
-          <w14:ligatures w14:val="none"/>
-        </w:rPr>
-        <w:t>[ ]</w:t>
-      </w:r>
-      <w:proofErr w:type="gramEnd"/>
-      <w:r>
-        <w:rPr>
-          <w:rFonts w:ascii="Times New Roman" w:eastAsia="Times New Roman" w:hAnsi="Times New Roman" w:cs="Times New Roman"/>
-          <w:kern w:val="0"/>
-          <w:lang w:val="en-CH" w:eastAsia="en-CH"/>
-          <w14:ligatures w14:val="none"/>
-        </w:rPr>
-        <w:t xml:space="preserve"> Does the system include DC arc-fault detection and limit high-voltage DC hazards?</w:t>
+          <w:lang w:eastAsia="en-CH"/>
+          <w14:ligatures w14:val="none"/>
+        </w:rPr>
+      </w:pPr>
+      <w:r>
+        <w:rPr>
+          <w:rFonts w:ascii="Times New Roman" w:eastAsia="Times New Roman" w:hAnsi="Times New Roman" w:cs="Times New Roman"/>
+          <w:kern w:val="0"/>
+          <w:lang w:eastAsia="en-CH"/>
+          <w14:ligatures w14:val="none"/>
+        </w:rPr>
+        <w:t>[ ] Does the system include DC arc-fault detection and limit high-voltage DC hazards?</w:t>
       </w:r>
     </w:p>
     <w:p>
@@ -1054,29 +915,18 @@
         <w:rPr>
           <w:rFonts w:ascii="Times New Roman" w:eastAsia="Times New Roman" w:hAnsi="Times New Roman" w:cs="Times New Roman"/>
           <w:kern w:val="0"/>
-          <w:lang w:val="en-CH" w:eastAsia="en-CH"/>
-          <w14:ligatures w14:val="none"/>
-        </w:rPr>
-      </w:pPr>
-      <w:proofErr w:type="gramStart"/>
-      <w:r>
-        <w:rPr>
-          <w:rFonts w:ascii="Times New Roman" w:eastAsia="Times New Roman" w:hAnsi="Times New Roman" w:cs="Times New Roman"/>
-          <w:kern w:val="0"/>
-          <w:lang w:val="en-CH" w:eastAsia="en-CH"/>
-          <w14:ligatures w14:val="none"/>
-        </w:rPr>
-        <w:t>[ ]</w:t>
-      </w:r>
-      <w:proofErr w:type="gramEnd"/>
-      <w:r>
-        <w:rPr>
-          <w:rFonts w:ascii="Times New Roman" w:eastAsia="Times New Roman" w:hAnsi="Times New Roman" w:cs="Times New Roman"/>
-          <w:kern w:val="0"/>
-          <w:lang w:val="en-CH" w:eastAsia="en-CH"/>
-          <w14:ligatures w14:val="none"/>
-        </w:rPr>
-        <w:t xml:space="preserve"> Are all components (panels, inverters, cables) certified to relevant IEC/UL/NEC standards?</w:t>
+          <w:lang w:eastAsia="en-CH"/>
+          <w14:ligatures w14:val="none"/>
+        </w:rPr>
+      </w:pPr>
+      <w:r>
+        <w:rPr>
+          <w:rFonts w:ascii="Times New Roman" w:eastAsia="Times New Roman" w:hAnsi="Times New Roman" w:cs="Times New Roman"/>
+          <w:kern w:val="0"/>
+          <w:lang w:eastAsia="en-CH"/>
+          <w14:ligatures w14:val="none"/>
+        </w:rPr>
+        <w:t>[ ] Are all components (panels, inverters, cables) certified to relevant IEC/UL/NEC standards?</w:t>
       </w:r>
     </w:p>
     <w:p>
@@ -1089,29 +939,18 @@
         <w:rPr>
           <w:rFonts w:ascii="Times New Roman" w:eastAsia="Times New Roman" w:hAnsi="Times New Roman" w:cs="Times New Roman"/>
           <w:kern w:val="0"/>
-          <w:lang w:val="en-CH" w:eastAsia="en-CH"/>
-          <w14:ligatures w14:val="none"/>
-        </w:rPr>
-      </w:pPr>
-      <w:proofErr w:type="gramStart"/>
-      <w:r>
-        <w:rPr>
-          <w:rFonts w:ascii="Times New Roman" w:eastAsia="Times New Roman" w:hAnsi="Times New Roman" w:cs="Times New Roman"/>
-          <w:kern w:val="0"/>
-          <w:lang w:val="en-CH" w:eastAsia="en-CH"/>
-          <w14:ligatures w14:val="none"/>
-        </w:rPr>
-        <w:t>[ ]</w:t>
-      </w:r>
-      <w:proofErr w:type="gramEnd"/>
-      <w:r>
-        <w:rPr>
-          <w:rFonts w:ascii="Times New Roman" w:eastAsia="Times New Roman" w:hAnsi="Times New Roman" w:cs="Times New Roman"/>
-          <w:kern w:val="0"/>
-          <w:lang w:val="en-CH" w:eastAsia="en-CH"/>
-          <w14:ligatures w14:val="none"/>
-        </w:rPr>
-        <w:t xml:space="preserve"> Does the inverter include anti-islanding protection?</w:t>
+          <w:lang w:eastAsia="en-CH"/>
+          <w14:ligatures w14:val="none"/>
+        </w:rPr>
+      </w:pPr>
+      <w:r>
+        <w:rPr>
+          <w:rFonts w:ascii="Times New Roman" w:eastAsia="Times New Roman" w:hAnsi="Times New Roman" w:cs="Times New Roman"/>
+          <w:kern w:val="0"/>
+          <w:lang w:eastAsia="en-CH"/>
+          <w14:ligatures w14:val="none"/>
+        </w:rPr>
+        <w:t>[ ] Does the inverter include anti-islanding protection?</w:t>
       </w:r>
     </w:p>
     <w:p>
@@ -1120,7 +959,7 @@
         <w:rPr>
           <w:rFonts w:ascii="Times New Roman" w:eastAsia="Times New Roman" w:hAnsi="Times New Roman" w:cs="Times New Roman"/>
           <w:kern w:val="0"/>
-          <w:lang w:val="en-CH" w:eastAsia="en-CH"/>
+          <w:lang w:eastAsia="en-CH"/>
           <w14:ligatures w14:val="none"/>
         </w:rPr>
       </w:pPr>
@@ -1130,7 +969,7 @@
           <w:b/>
           <w:bCs/>
           <w:kern w:val="0"/>
-          <w:lang w:val="en-CH" w:eastAsia="en-CH"/>
+          <w:lang w:eastAsia="en-CH"/>
           <w14:ligatures w14:val="none"/>
         </w:rPr>
         <w:t>5. Reliability &amp; Economics</w:t>
@@ -1146,29 +985,18 @@
         <w:rPr>
           <w:rFonts w:ascii="Times New Roman" w:eastAsia="Times New Roman" w:hAnsi="Times New Roman" w:cs="Times New Roman"/>
           <w:kern w:val="0"/>
-          <w:lang w:val="en-CH" w:eastAsia="en-CH"/>
-          <w14:ligatures w14:val="none"/>
-        </w:rPr>
-      </w:pPr>
-      <w:proofErr w:type="gramStart"/>
-      <w:r>
-        <w:rPr>
-          <w:rFonts w:ascii="Times New Roman" w:eastAsia="Times New Roman" w:hAnsi="Times New Roman" w:cs="Times New Roman"/>
-          <w:kern w:val="0"/>
-          <w:lang w:val="en-CH" w:eastAsia="en-CH"/>
-          <w14:ligatures w14:val="none"/>
-        </w:rPr>
-        <w:t>[ ]</w:t>
-      </w:r>
-      <w:proofErr w:type="gramEnd"/>
-      <w:r>
-        <w:rPr>
-          <w:rFonts w:ascii="Times New Roman" w:eastAsia="Times New Roman" w:hAnsi="Times New Roman" w:cs="Times New Roman"/>
-          <w:kern w:val="0"/>
-          <w:lang w:val="en-CH" w:eastAsia="en-CH"/>
-          <w14:ligatures w14:val="none"/>
-        </w:rPr>
-        <w:t xml:space="preserve"> Has environmental stress testing been considered for electronics placed within the hot facade environment?</w:t>
+          <w:lang w:eastAsia="en-CH"/>
+          <w14:ligatures w14:val="none"/>
+        </w:rPr>
+      </w:pPr>
+      <w:r>
+        <w:rPr>
+          <w:rFonts w:ascii="Times New Roman" w:eastAsia="Times New Roman" w:hAnsi="Times New Roman" w:cs="Times New Roman"/>
+          <w:kern w:val="0"/>
+          <w:lang w:eastAsia="en-CH"/>
+          <w14:ligatures w14:val="none"/>
+        </w:rPr>
+        <w:t>[ ] Has environmental stress testing been considered for electronics placed within the hot facade environment?</w:t>
       </w:r>
     </w:p>
     <w:p>
@@ -1181,50 +1009,19 @@
         <w:rPr>
           <w:rFonts w:ascii="Times New Roman" w:eastAsia="Times New Roman" w:hAnsi="Times New Roman" w:cs="Times New Roman"/>
           <w:kern w:val="0"/>
-          <w:lang w:val="en-CH" w:eastAsia="en-CH"/>
-          <w14:ligatures w14:val="none"/>
-        </w:rPr>
-      </w:pPr>
-      <w:proofErr w:type="gramStart"/>
-      <w:r>
-        <w:rPr>
-          <w:rFonts w:ascii="Times New Roman" w:eastAsia="Times New Roman" w:hAnsi="Times New Roman" w:cs="Times New Roman"/>
-          <w:kern w:val="0"/>
-          <w:lang w:val="en-CH" w:eastAsia="en-CH"/>
+          <w:lang w:eastAsia="en-CH"/>
+          <w14:ligatures w14:val="none"/>
+        </w:rPr>
+      </w:pPr>
+      <w:r>
+        <w:rPr>
+          <w:rFonts w:ascii="Times New Roman" w:eastAsia="Times New Roman" w:hAnsi="Times New Roman" w:cs="Times New Roman"/>
+          <w:kern w:val="0"/>
+          <w:lang w:eastAsia="en-CH"/>
           <w14:ligatures w14:val="none"/>
         </w:rPr>
         <w:lastRenderedPageBreak/>
-        <w:t>[ ]</w:t>
-      </w:r>
-      <w:proofErr w:type="gramEnd"/>
-      <w:r>
-        <w:rPr>
-          <w:rFonts w:ascii="Times New Roman" w:eastAsia="Times New Roman" w:hAnsi="Times New Roman" w:cs="Times New Roman"/>
-          <w:kern w:val="0"/>
-          <w:lang w:val="en-CH" w:eastAsia="en-CH"/>
-          <w14:ligatures w14:val="none"/>
-        </w:rPr>
-        <w:t xml:space="preserve"> </w:t>
-      </w:r>
-      <w:proofErr w:type="gramStart"/>
-      <w:r>
-        <w:rPr>
-          <w:rFonts w:ascii="Times New Roman" w:eastAsia="Times New Roman" w:hAnsi="Times New Roman" w:cs="Times New Roman"/>
-          <w:kern w:val="0"/>
-          <w:lang w:val="en-CH" w:eastAsia="en-CH"/>
-          <w14:ligatures w14:val="none"/>
-        </w:rPr>
-        <w:t>Are</w:t>
-      </w:r>
-      <w:proofErr w:type="gramEnd"/>
-      <w:r>
-        <w:rPr>
-          <w:rFonts w:ascii="Times New Roman" w:eastAsia="Times New Roman" w:hAnsi="Times New Roman" w:cs="Times New Roman"/>
-          <w:kern w:val="0"/>
-          <w:lang w:val="en-CH" w:eastAsia="en-CH"/>
-          <w14:ligatures w14:val="none"/>
-        </w:rPr>
-        <w:t xml:space="preserve"> the installation time, wiring complexity, and CAPEX within the project's acceptable thresholds?</w:t>
+        <w:t>[ ] Are the installation time, wiring complexity, and CAPEX within the project's acceptable thresholds?</w:t>
       </w:r>
     </w:p>
     <w:p>
@@ -1237,38 +1034,21 @@
         <w:rPr>
           <w:rFonts w:ascii="Times New Roman" w:eastAsia="Times New Roman" w:hAnsi="Times New Roman" w:cs="Times New Roman"/>
           <w:kern w:val="0"/>
-          <w:lang w:val="en-CH" w:eastAsia="en-CH"/>
-          <w14:ligatures w14:val="none"/>
-        </w:rPr>
-      </w:pPr>
-      <w:proofErr w:type="gramStart"/>
-      <w:r>
-        <w:rPr>
-          <w:rFonts w:ascii="Times New Roman" w:eastAsia="Times New Roman" w:hAnsi="Times New Roman" w:cs="Times New Roman"/>
-          <w:kern w:val="0"/>
-          <w:lang w:val="en-CH" w:eastAsia="en-CH"/>
-          <w14:ligatures w14:val="none"/>
-        </w:rPr>
-        <w:t>[ ]</w:t>
-      </w:r>
-      <w:proofErr w:type="gramEnd"/>
-      <w:r>
-        <w:rPr>
-          <w:rFonts w:ascii="Times New Roman" w:eastAsia="Times New Roman" w:hAnsi="Times New Roman" w:cs="Times New Roman"/>
-          <w:kern w:val="0"/>
-          <w:lang w:val="en-CH" w:eastAsia="en-CH"/>
-          <w14:ligatures w14:val="none"/>
-        </w:rPr>
-        <w:t xml:space="preserve"> Have standard protocols (e.g., KNX, Modbus) been selected for BMS monitoring integration?</w:t>
-      </w:r>
-    </w:p>
-    <w:p>
-      <w:pPr>
-        <w:rPr>
-          <w:lang w:val="en-CH"/>
-        </w:rPr>
-      </w:pPr>
-    </w:p>
+          <w:lang w:eastAsia="en-CH"/>
+          <w14:ligatures w14:val="none"/>
+        </w:rPr>
+      </w:pPr>
+      <w:r>
+        <w:rPr>
+          <w:rFonts w:ascii="Times New Roman" w:eastAsia="Times New Roman" w:hAnsi="Times New Roman" w:cs="Times New Roman"/>
+          <w:kern w:val="0"/>
+          <w:lang w:eastAsia="en-CH"/>
+          <w14:ligatures w14:val="none"/>
+        </w:rPr>
+        <w:t>[ ] Have standard protocols (e.g., KNX, Modbus) been selected for BMS monitoring integration?</w:t>
+      </w:r>
+    </w:p>
+    <w:p/>
     <w:sectPr>
       <w:pgSz w:w="11906" w:h="16838"/>
       <w:pgMar w:top="1440" w:right="1440" w:bottom="1440" w:left="1440" w:header="708" w:footer="708" w:gutter="0"/>

</xml_diff>